<commit_message>
ProjectInfo form and starting-research updates
</commit_message>
<xml_diff>
--- a/templates/Jornada_projectinfo_template.docx
+++ b/templates/Jornada_projectinfo_template.docx
@@ -1,6 +1,6 @@
 
 <file path=word/document.xml><?xml version="1.0" encoding="utf-8"?>
-<w:document xmlns:wpc="http://schemas.microsoft.com/office/word/2010/wordprocessingCanvas" xmlns:cx="http://schemas.microsoft.com/office/drawing/2014/chartex" xmlns:cx1="http://schemas.microsoft.com/office/drawing/2015/9/8/chartex" xmlns:cx2="http://schemas.microsoft.com/office/drawing/2015/10/21/chartex" xmlns:cx3="http://schemas.microsoft.com/office/drawing/2016/5/9/chartex" xmlns:cx4="http://schemas.microsoft.com/office/drawing/2016/5/10/chartex" xmlns:cx5="http://schemas.microsoft.com/office/drawing/2016/5/11/chartex" xmlns:cx6="http://schemas.microsoft.com/office/drawing/2016/5/12/chartex" xmlns:cx7="http://schemas.microsoft.com/office/drawing/2016/5/13/chartex" xmlns:cx8="http://schemas.microsoft.com/office/drawing/2016/5/14/chartex" xmlns:mc="http://schemas.openxmlformats.org/markup-compatibility/2006" xmlns:aink="http://schemas.microsoft.com/office/drawing/2016/ink" xmlns:am3d="http://schemas.microsoft.com/office/drawing/2017/model3d" xmlns:o="urn:schemas-microsoft-com:office:office" xmlns:r="http://schemas.openxmlformats.org/officeDocument/2006/relationships" xmlns:m="http://schemas.openxmlformats.org/officeDocument/2006/math" xmlns:v="urn:schemas-microsoft-com:vml" xmlns:wp14="http://schemas.microsoft.com/office/word/2010/wordprocessingDrawing" xmlns:wp="http://schemas.openxmlformats.org/drawingml/2006/wordprocessingDrawing" xmlns:w10="urn:schemas-microsoft-com:office:word" xmlns:w="http://schemas.openxmlformats.org/wordprocessingml/2006/main" xmlns:w14="http://schemas.microsoft.com/office/word/2010/wordml" xmlns:w15="http://schemas.microsoft.com/office/word/2012/wordml" xmlns:w16cex="http://schemas.microsoft.com/office/word/2018/wordml/cex" xmlns:w16cid="http://schemas.microsoft.com/office/word/2016/wordml/cid" xmlns:w16="http://schemas.microsoft.com/office/word/2018/wordml" xmlns:w16se="http://schemas.microsoft.com/office/word/2015/wordml/symex" xmlns:wpg="http://schemas.microsoft.com/office/word/2010/wordprocessingGroup" xmlns:wpi="http://schemas.microsoft.com/office/word/2010/wordprocessingInk" xmlns:wne="http://schemas.microsoft.com/office/word/2006/wordml" xmlns:wps="http://schemas.microsoft.com/office/word/2010/wordprocessingShape" mc:Ignorable="w14 w15 w16se w16cid w16 w16cex wp14">
+<w:document xmlns:wpc="http://schemas.microsoft.com/office/word/2010/wordprocessingCanvas" xmlns:cx="http://schemas.microsoft.com/office/drawing/2014/chartex" xmlns:cx1="http://schemas.microsoft.com/office/drawing/2015/9/8/chartex" xmlns:cx2="http://schemas.microsoft.com/office/drawing/2015/10/21/chartex" xmlns:cx3="http://schemas.microsoft.com/office/drawing/2016/5/9/chartex" xmlns:cx4="http://schemas.microsoft.com/office/drawing/2016/5/10/chartex" xmlns:cx5="http://schemas.microsoft.com/office/drawing/2016/5/11/chartex" xmlns:cx6="http://schemas.microsoft.com/office/drawing/2016/5/12/chartex" xmlns:cx7="http://schemas.microsoft.com/office/drawing/2016/5/13/chartex" xmlns:cx8="http://schemas.microsoft.com/office/drawing/2016/5/14/chartex" xmlns:mc="http://schemas.openxmlformats.org/markup-compatibility/2006" xmlns:aink="http://schemas.microsoft.com/office/drawing/2016/ink" xmlns:am3d="http://schemas.microsoft.com/office/drawing/2017/model3d" xmlns:o="urn:schemas-microsoft-com:office:office" xmlns:oel="http://schemas.microsoft.com/office/2019/extlst" xmlns:r="http://schemas.openxmlformats.org/officeDocument/2006/relationships" xmlns:m="http://schemas.openxmlformats.org/officeDocument/2006/math" xmlns:v="urn:schemas-microsoft-com:vml" xmlns:wp14="http://schemas.microsoft.com/office/word/2010/wordprocessingDrawing" xmlns:wp="http://schemas.openxmlformats.org/drawingml/2006/wordprocessingDrawing" xmlns:w10="urn:schemas-microsoft-com:office:word" xmlns:w="http://schemas.openxmlformats.org/wordprocessingml/2006/main" xmlns:w14="http://schemas.microsoft.com/office/word/2010/wordml" xmlns:w15="http://schemas.microsoft.com/office/word/2012/wordml" xmlns:w16cex="http://schemas.microsoft.com/office/word/2018/wordml/cex" xmlns:w16cid="http://schemas.microsoft.com/office/word/2016/wordml/cid" xmlns:w16="http://schemas.microsoft.com/office/word/2018/wordml" xmlns:w16du="http://schemas.microsoft.com/office/word/2023/wordml/word16du" xmlns:w16sdtdh="http://schemas.microsoft.com/office/word/2020/wordml/sdtdatahash" xmlns:w16sdtfl="http://schemas.microsoft.com/office/word/2024/wordml/sdtformatlock" xmlns:w16se="http://schemas.microsoft.com/office/word/2015/wordml/symex" xmlns:wpg="http://schemas.microsoft.com/office/word/2010/wordprocessingGroup" xmlns:wpi="http://schemas.microsoft.com/office/word/2010/wordprocessingInk" xmlns:wne="http://schemas.microsoft.com/office/word/2006/wordml" xmlns:wps="http://schemas.microsoft.com/office/word/2010/wordprocessingShape" mc:Ignorable="w14 w15 w16se w16cid w16 w16cex w16sdtdh w16sdtfl w16du wp14">
   <w:body>
     <w:p>
       <w:pPr>
@@ -22,7 +22,10 @@
         <w:t xml:space="preserve"> Template (20</w:t>
       </w:r>
       <w:r>
-        <w:t>20</w:t>
+        <w:t>2</w:t>
+      </w:r>
+      <w:r>
+        <w:t>5</w:t>
       </w:r>
       <w:r>
         <w:t>)</w:t>
@@ -98,7 +101,21 @@
           <w:i/>
           <w:iCs/>
         </w:rPr>
-        <w:t xml:space="preserve"> This should be submitted within 6 months of initiating a new project via the “Research Notification” process and then </w:t>
+        <w:t xml:space="preserve"> This should be submitted </w:t>
+      </w:r>
+      <w:r>
+        <w:rPr>
+          <w:i/>
+          <w:iCs/>
+        </w:rPr>
+        <w:t xml:space="preserve">for the first time </w:t>
+      </w:r>
+      <w:r>
+        <w:rPr>
+          <w:i/>
+          <w:iCs/>
+        </w:rPr>
+        <w:t xml:space="preserve">within 6 months of initiating a new project via the “Research Notification” process and then </w:t>
       </w:r>
       <w:r>
         <w:rPr>
@@ -119,7 +136,21 @@
           <w:i/>
           <w:iCs/>
         </w:rPr>
-        <w:t xml:space="preserve"> For questions, please contact the JRN Information Manager (IM) at datamanager.jrn.lter@gmail.com.</w:t>
+        <w:t xml:space="preserve"> For questions, please contact the JRN Information Manager (IM) at </w:t>
+      </w:r>
+      <w:r>
+        <w:rPr>
+          <w:i/>
+          <w:iCs/>
+        </w:rPr>
+        <w:t>jornada.data@nmsu.edu</w:t>
+      </w:r>
+      <w:r>
+        <w:rPr>
+          <w:i/>
+          <w:iCs/>
+        </w:rPr>
+        <w:t>.</w:t>
       </w:r>
     </w:p>
     <w:p>
@@ -262,6 +293,38 @@
       </w:tr>
     </w:tbl>
     <w:p/>
+    <w:p>
+      <w:pPr>
+        <w:pStyle w:val="Heading2"/>
+      </w:pPr>
+      <w:r>
+        <w:t>Changes</w:t>
+      </w:r>
+    </w:p>
+    <w:p>
+      <w:r>
+        <w:t>(</w:t>
+      </w:r>
+      <w:r>
+        <w:t xml:space="preserve">Please summarize any changes to your study design or implementation since submission and approval of the original </w:t>
+      </w:r>
+      <w:proofErr w:type="spellStart"/>
+      <w:r>
+        <w:t>ResNotif</w:t>
+      </w:r>
+      <w:proofErr w:type="spellEnd"/>
+      <w:r>
+        <w:t xml:space="preserve"> form for the project. Then, describe these in more detail in sections below.</w:t>
+      </w:r>
+      <w:r>
+        <w:t>):</w:t>
+      </w:r>
+    </w:p>
+    <w:p>
+      <w:pPr>
+        <w:pStyle w:val="Heading2"/>
+      </w:pPr>
+    </w:p>
     <w:p>
       <w:pPr>
         <w:pStyle w:val="Heading2"/>
@@ -1308,6 +1371,7 @@
         <w:pStyle w:val="Heading2"/>
       </w:pPr>
       <w:r>
+        <w:lastRenderedPageBreak/>
         <w:t>Geographic location</w:t>
       </w:r>
     </w:p>
@@ -1361,7 +1425,6 @@
         </w:numPr>
       </w:pPr>
       <w:r>
-        <w:lastRenderedPageBreak/>
         <w:t>East bounding coordinates (decimals)</w:t>
       </w:r>
     </w:p>
@@ -2654,7 +2717,6 @@
         <w:pStyle w:val="Heading2"/>
       </w:pPr>
       <w:r>
-        <w:lastRenderedPageBreak/>
         <w:t>Articles</w:t>
       </w:r>
     </w:p>
@@ -3038,7 +3100,7 @@
 </file>
 
 <file path=word/endnotes.xml><?xml version="1.0" encoding="utf-8"?>
-<w:endnotes xmlns:wpc="http://schemas.microsoft.com/office/word/2010/wordprocessingCanvas" xmlns:cx="http://schemas.microsoft.com/office/drawing/2014/chartex" xmlns:cx1="http://schemas.microsoft.com/office/drawing/2015/9/8/chartex" xmlns:cx2="http://schemas.microsoft.com/office/drawing/2015/10/21/chartex" xmlns:cx3="http://schemas.microsoft.com/office/drawing/2016/5/9/chartex" xmlns:cx4="http://schemas.microsoft.com/office/drawing/2016/5/10/chartex" xmlns:cx5="http://schemas.microsoft.com/office/drawing/2016/5/11/chartex" xmlns:cx6="http://schemas.microsoft.com/office/drawing/2016/5/12/chartex" xmlns:cx7="http://schemas.microsoft.com/office/drawing/2016/5/13/chartex" xmlns:cx8="http://schemas.microsoft.com/office/drawing/2016/5/14/chartex" xmlns:mc="http://schemas.openxmlformats.org/markup-compatibility/2006" xmlns:aink="http://schemas.microsoft.com/office/drawing/2016/ink" xmlns:am3d="http://schemas.microsoft.com/office/drawing/2017/model3d" xmlns:o="urn:schemas-microsoft-com:office:office" xmlns:r="http://schemas.openxmlformats.org/officeDocument/2006/relationships" xmlns:m="http://schemas.openxmlformats.org/officeDocument/2006/math" xmlns:v="urn:schemas-microsoft-com:vml" xmlns:wp14="http://schemas.microsoft.com/office/word/2010/wordprocessingDrawing" xmlns:wp="http://schemas.openxmlformats.org/drawingml/2006/wordprocessingDrawing" xmlns:w10="urn:schemas-microsoft-com:office:word" xmlns:w="http://schemas.openxmlformats.org/wordprocessingml/2006/main" xmlns:w14="http://schemas.microsoft.com/office/word/2010/wordml" xmlns:w15="http://schemas.microsoft.com/office/word/2012/wordml" xmlns:w16cex="http://schemas.microsoft.com/office/word/2018/wordml/cex" xmlns:w16cid="http://schemas.microsoft.com/office/word/2016/wordml/cid" xmlns:w16="http://schemas.microsoft.com/office/word/2018/wordml" xmlns:w16se="http://schemas.microsoft.com/office/word/2015/wordml/symex" xmlns:wpg="http://schemas.microsoft.com/office/word/2010/wordprocessingGroup" xmlns:wpi="http://schemas.microsoft.com/office/word/2010/wordprocessingInk" xmlns:wne="http://schemas.microsoft.com/office/word/2006/wordml" xmlns:wps="http://schemas.microsoft.com/office/word/2010/wordprocessingShape" mc:Ignorable="w14 w15 w16se w16cid w16 w16cex wp14">
+<w:endnotes xmlns:wpc="http://schemas.microsoft.com/office/word/2010/wordprocessingCanvas" xmlns:cx="http://schemas.microsoft.com/office/drawing/2014/chartex" xmlns:cx1="http://schemas.microsoft.com/office/drawing/2015/9/8/chartex" xmlns:cx2="http://schemas.microsoft.com/office/drawing/2015/10/21/chartex" xmlns:cx3="http://schemas.microsoft.com/office/drawing/2016/5/9/chartex" xmlns:cx4="http://schemas.microsoft.com/office/drawing/2016/5/10/chartex" xmlns:cx5="http://schemas.microsoft.com/office/drawing/2016/5/11/chartex" xmlns:cx6="http://schemas.microsoft.com/office/drawing/2016/5/12/chartex" xmlns:cx7="http://schemas.microsoft.com/office/drawing/2016/5/13/chartex" xmlns:cx8="http://schemas.microsoft.com/office/drawing/2016/5/14/chartex" xmlns:mc="http://schemas.openxmlformats.org/markup-compatibility/2006" xmlns:aink="http://schemas.microsoft.com/office/drawing/2016/ink" xmlns:am3d="http://schemas.microsoft.com/office/drawing/2017/model3d" xmlns:o="urn:schemas-microsoft-com:office:office" xmlns:oel="http://schemas.microsoft.com/office/2019/extlst" xmlns:r="http://schemas.openxmlformats.org/officeDocument/2006/relationships" xmlns:m="http://schemas.openxmlformats.org/officeDocument/2006/math" xmlns:v="urn:schemas-microsoft-com:vml" xmlns:wp14="http://schemas.microsoft.com/office/word/2010/wordprocessingDrawing" xmlns:wp="http://schemas.openxmlformats.org/drawingml/2006/wordprocessingDrawing" xmlns:w10="urn:schemas-microsoft-com:office:word" xmlns:w="http://schemas.openxmlformats.org/wordprocessingml/2006/main" xmlns:w14="http://schemas.microsoft.com/office/word/2010/wordml" xmlns:w15="http://schemas.microsoft.com/office/word/2012/wordml" xmlns:w16cex="http://schemas.microsoft.com/office/word/2018/wordml/cex" xmlns:w16cid="http://schemas.microsoft.com/office/word/2016/wordml/cid" xmlns:w16="http://schemas.microsoft.com/office/word/2018/wordml" xmlns:w16du="http://schemas.microsoft.com/office/word/2023/wordml/word16du" xmlns:w16sdtdh="http://schemas.microsoft.com/office/word/2020/wordml/sdtdatahash" xmlns:w16sdtfl="http://schemas.microsoft.com/office/word/2024/wordml/sdtformatlock" xmlns:w16se="http://schemas.microsoft.com/office/word/2015/wordml/symex" xmlns:wpg="http://schemas.microsoft.com/office/word/2010/wordprocessingGroup" xmlns:wpi="http://schemas.microsoft.com/office/word/2010/wordprocessingInk" xmlns:wne="http://schemas.microsoft.com/office/word/2006/wordml" xmlns:wps="http://schemas.microsoft.com/office/word/2010/wordprocessingShape" mc:Ignorable="w14 w15 w16se w16cid w16 w16cex w16sdtdh w16sdtfl w16du wp14">
   <w:endnote w:type="separator" w:id="-1">
     <w:p>
       <w:pPr>
@@ -3063,7 +3125,7 @@
 </file>
 
 <file path=word/footnotes.xml><?xml version="1.0" encoding="utf-8"?>
-<w:footnotes xmlns:wpc="http://schemas.microsoft.com/office/word/2010/wordprocessingCanvas" xmlns:cx="http://schemas.microsoft.com/office/drawing/2014/chartex" xmlns:cx1="http://schemas.microsoft.com/office/drawing/2015/9/8/chartex" xmlns:cx2="http://schemas.microsoft.com/office/drawing/2015/10/21/chartex" xmlns:cx3="http://schemas.microsoft.com/office/drawing/2016/5/9/chartex" xmlns:cx4="http://schemas.microsoft.com/office/drawing/2016/5/10/chartex" xmlns:cx5="http://schemas.microsoft.com/office/drawing/2016/5/11/chartex" xmlns:cx6="http://schemas.microsoft.com/office/drawing/2016/5/12/chartex" xmlns:cx7="http://schemas.microsoft.com/office/drawing/2016/5/13/chartex" xmlns:cx8="http://schemas.microsoft.com/office/drawing/2016/5/14/chartex" xmlns:mc="http://schemas.openxmlformats.org/markup-compatibility/2006" xmlns:aink="http://schemas.microsoft.com/office/drawing/2016/ink" xmlns:am3d="http://schemas.microsoft.com/office/drawing/2017/model3d" xmlns:o="urn:schemas-microsoft-com:office:office" xmlns:r="http://schemas.openxmlformats.org/officeDocument/2006/relationships" xmlns:m="http://schemas.openxmlformats.org/officeDocument/2006/math" xmlns:v="urn:schemas-microsoft-com:vml" xmlns:wp14="http://schemas.microsoft.com/office/word/2010/wordprocessingDrawing" xmlns:wp="http://schemas.openxmlformats.org/drawingml/2006/wordprocessingDrawing" xmlns:w10="urn:schemas-microsoft-com:office:word" xmlns:w="http://schemas.openxmlformats.org/wordprocessingml/2006/main" xmlns:w14="http://schemas.microsoft.com/office/word/2010/wordml" xmlns:w15="http://schemas.microsoft.com/office/word/2012/wordml" xmlns:w16cex="http://schemas.microsoft.com/office/word/2018/wordml/cex" xmlns:w16cid="http://schemas.microsoft.com/office/word/2016/wordml/cid" xmlns:w16="http://schemas.microsoft.com/office/word/2018/wordml" xmlns:w16se="http://schemas.microsoft.com/office/word/2015/wordml/symex" xmlns:wpg="http://schemas.microsoft.com/office/word/2010/wordprocessingGroup" xmlns:wpi="http://schemas.microsoft.com/office/word/2010/wordprocessingInk" xmlns:wne="http://schemas.microsoft.com/office/word/2006/wordml" xmlns:wps="http://schemas.microsoft.com/office/word/2010/wordprocessingShape" mc:Ignorable="w14 w15 w16se w16cid w16 w16cex wp14">
+<w:footnotes xmlns:wpc="http://schemas.microsoft.com/office/word/2010/wordprocessingCanvas" xmlns:cx="http://schemas.microsoft.com/office/drawing/2014/chartex" xmlns:cx1="http://schemas.microsoft.com/office/drawing/2015/9/8/chartex" xmlns:cx2="http://schemas.microsoft.com/office/drawing/2015/10/21/chartex" xmlns:cx3="http://schemas.microsoft.com/office/drawing/2016/5/9/chartex" xmlns:cx4="http://schemas.microsoft.com/office/drawing/2016/5/10/chartex" xmlns:cx5="http://schemas.microsoft.com/office/drawing/2016/5/11/chartex" xmlns:cx6="http://schemas.microsoft.com/office/drawing/2016/5/12/chartex" xmlns:cx7="http://schemas.microsoft.com/office/drawing/2016/5/13/chartex" xmlns:cx8="http://schemas.microsoft.com/office/drawing/2016/5/14/chartex" xmlns:mc="http://schemas.openxmlformats.org/markup-compatibility/2006" xmlns:aink="http://schemas.microsoft.com/office/drawing/2016/ink" xmlns:am3d="http://schemas.microsoft.com/office/drawing/2017/model3d" xmlns:o="urn:schemas-microsoft-com:office:office" xmlns:oel="http://schemas.microsoft.com/office/2019/extlst" xmlns:r="http://schemas.openxmlformats.org/officeDocument/2006/relationships" xmlns:m="http://schemas.openxmlformats.org/officeDocument/2006/math" xmlns:v="urn:schemas-microsoft-com:vml" xmlns:wp14="http://schemas.microsoft.com/office/word/2010/wordprocessingDrawing" xmlns:wp="http://schemas.openxmlformats.org/drawingml/2006/wordprocessingDrawing" xmlns:w10="urn:schemas-microsoft-com:office:word" xmlns:w="http://schemas.openxmlformats.org/wordprocessingml/2006/main" xmlns:w14="http://schemas.microsoft.com/office/word/2010/wordml" xmlns:w15="http://schemas.microsoft.com/office/word/2012/wordml" xmlns:w16cex="http://schemas.microsoft.com/office/word/2018/wordml/cex" xmlns:w16cid="http://schemas.microsoft.com/office/word/2016/wordml/cid" xmlns:w16="http://schemas.microsoft.com/office/word/2018/wordml" xmlns:w16du="http://schemas.microsoft.com/office/word/2023/wordml/word16du" xmlns:w16sdtdh="http://schemas.microsoft.com/office/word/2020/wordml/sdtdatahash" xmlns:w16sdtfl="http://schemas.microsoft.com/office/word/2024/wordml/sdtformatlock" xmlns:w16se="http://schemas.microsoft.com/office/word/2015/wordml/symex" xmlns:wpg="http://schemas.microsoft.com/office/word/2010/wordprocessingGroup" xmlns:wpi="http://schemas.microsoft.com/office/word/2010/wordprocessingInk" xmlns:wne="http://schemas.microsoft.com/office/word/2006/wordml" xmlns:wps="http://schemas.microsoft.com/office/word/2010/wordprocessingShape" mc:Ignorable="w14 w15 w16se w16cid w16 w16cex w16sdtdh w16sdtfl w16du wp14">
   <w:footnote w:type="separator" w:id="-1">
     <w:p>
       <w:pPr>
@@ -3105,7 +3167,10 @@
         <w:t xml:space="preserve"> from John Anderson’s “PRJ” form: </w:t>
       </w:r>
       <w:r>
-        <w:t>https://jornada.nmsu.edu/files/documentationForms.zip</w:t>
+        <w:t>https://</w:t>
+      </w:r>
+      <w:r>
+        <w:t>jornada-im.github.io/archive/documentationForms_old.zip</w:t>
       </w:r>
     </w:p>
   </w:footnote>
@@ -3113,7 +3178,7 @@
 </file>
 
 <file path=word/numbering.xml><?xml version="1.0" encoding="utf-8"?>
-<w:numbering xmlns:wpc="http://schemas.microsoft.com/office/word/2010/wordprocessingCanvas" xmlns:cx="http://schemas.microsoft.com/office/drawing/2014/chartex" xmlns:cx1="http://schemas.microsoft.com/office/drawing/2015/9/8/chartex" xmlns:cx2="http://schemas.microsoft.com/office/drawing/2015/10/21/chartex" xmlns:cx3="http://schemas.microsoft.com/office/drawing/2016/5/9/chartex" xmlns:cx4="http://schemas.microsoft.com/office/drawing/2016/5/10/chartex" xmlns:cx5="http://schemas.microsoft.com/office/drawing/2016/5/11/chartex" xmlns:cx6="http://schemas.microsoft.com/office/drawing/2016/5/12/chartex" xmlns:cx7="http://schemas.microsoft.com/office/drawing/2016/5/13/chartex" xmlns:cx8="http://schemas.microsoft.com/office/drawing/2016/5/14/chartex" xmlns:mc="http://schemas.openxmlformats.org/markup-compatibility/2006" xmlns:aink="http://schemas.microsoft.com/office/drawing/2016/ink" xmlns:am3d="http://schemas.microsoft.com/office/drawing/2017/model3d" xmlns:o="urn:schemas-microsoft-com:office:office" xmlns:r="http://schemas.openxmlformats.org/officeDocument/2006/relationships" xmlns:m="http://schemas.openxmlformats.org/officeDocument/2006/math" xmlns:v="urn:schemas-microsoft-com:vml" xmlns:wp14="http://schemas.microsoft.com/office/word/2010/wordprocessingDrawing" xmlns:wp="http://schemas.openxmlformats.org/drawingml/2006/wordprocessingDrawing" xmlns:w10="urn:schemas-microsoft-com:office:word" xmlns:w="http://schemas.openxmlformats.org/wordprocessingml/2006/main" xmlns:w14="http://schemas.microsoft.com/office/word/2010/wordml" xmlns:w15="http://schemas.microsoft.com/office/word/2012/wordml" xmlns:w16cex="http://schemas.microsoft.com/office/word/2018/wordml/cex" xmlns:w16cid="http://schemas.microsoft.com/office/word/2016/wordml/cid" xmlns:w16="http://schemas.microsoft.com/office/word/2018/wordml" xmlns:w16se="http://schemas.microsoft.com/office/word/2015/wordml/symex" xmlns:wpg="http://schemas.microsoft.com/office/word/2010/wordprocessingGroup" xmlns:wpi="http://schemas.microsoft.com/office/word/2010/wordprocessingInk" xmlns:wne="http://schemas.microsoft.com/office/word/2006/wordml" xmlns:wps="http://schemas.microsoft.com/office/word/2010/wordprocessingShape" mc:Ignorable="w14 w15 w16se w16cid w16 w16cex wp14">
+<w:numbering xmlns:wpc="http://schemas.microsoft.com/office/word/2010/wordprocessingCanvas" xmlns:cx="http://schemas.microsoft.com/office/drawing/2014/chartex" xmlns:cx1="http://schemas.microsoft.com/office/drawing/2015/9/8/chartex" xmlns:cx2="http://schemas.microsoft.com/office/drawing/2015/10/21/chartex" xmlns:cx3="http://schemas.microsoft.com/office/drawing/2016/5/9/chartex" xmlns:cx4="http://schemas.microsoft.com/office/drawing/2016/5/10/chartex" xmlns:cx5="http://schemas.microsoft.com/office/drawing/2016/5/11/chartex" xmlns:cx6="http://schemas.microsoft.com/office/drawing/2016/5/12/chartex" xmlns:cx7="http://schemas.microsoft.com/office/drawing/2016/5/13/chartex" xmlns:cx8="http://schemas.microsoft.com/office/drawing/2016/5/14/chartex" xmlns:mc="http://schemas.openxmlformats.org/markup-compatibility/2006" xmlns:aink="http://schemas.microsoft.com/office/drawing/2016/ink" xmlns:am3d="http://schemas.microsoft.com/office/drawing/2017/model3d" xmlns:o="urn:schemas-microsoft-com:office:office" xmlns:oel="http://schemas.microsoft.com/office/2019/extlst" xmlns:r="http://schemas.openxmlformats.org/officeDocument/2006/relationships" xmlns:m="http://schemas.openxmlformats.org/officeDocument/2006/math" xmlns:v="urn:schemas-microsoft-com:vml" xmlns:wp14="http://schemas.microsoft.com/office/word/2010/wordprocessingDrawing" xmlns:wp="http://schemas.openxmlformats.org/drawingml/2006/wordprocessingDrawing" xmlns:w10="urn:schemas-microsoft-com:office:word" xmlns:w="http://schemas.openxmlformats.org/wordprocessingml/2006/main" xmlns:w14="http://schemas.microsoft.com/office/word/2010/wordml" xmlns:w15="http://schemas.microsoft.com/office/word/2012/wordml" xmlns:w16cex="http://schemas.microsoft.com/office/word/2018/wordml/cex" xmlns:w16cid="http://schemas.microsoft.com/office/word/2016/wordml/cid" xmlns:w16="http://schemas.microsoft.com/office/word/2018/wordml" xmlns:w16du="http://schemas.microsoft.com/office/word/2023/wordml/word16du" xmlns:w16sdtdh="http://schemas.microsoft.com/office/word/2020/wordml/sdtdatahash" xmlns:w16sdtfl="http://schemas.microsoft.com/office/word/2024/wordml/sdtformatlock" xmlns:w16se="http://schemas.microsoft.com/office/word/2015/wordml/symex" xmlns:wpg="http://schemas.microsoft.com/office/word/2010/wordprocessingGroup" xmlns:wpi="http://schemas.microsoft.com/office/word/2010/wordprocessingInk" xmlns:wne="http://schemas.microsoft.com/office/word/2006/wordml" xmlns:wps="http://schemas.microsoft.com/office/word/2010/wordprocessingShape" mc:Ignorable="w14 w15 w16se w16cid w16 w16cex w16sdtdh w16sdtfl w16du wp14">
   <w:abstractNum w:abstractNumId="0" w15:restartNumberingAfterBreak="0">
     <w:nsid w:val="05136CC9"/>
     <w:multiLevelType w:val="hybridMultilevel"/>
@@ -3566,23 +3631,23 @@
       </w:rPr>
     </w:lvl>
   </w:abstractNum>
-  <w:num w:numId="1">
+  <w:num w:numId="1" w16cid:durableId="1506281576">
     <w:abstractNumId w:val="3"/>
   </w:num>
-  <w:num w:numId="2">
+  <w:num w:numId="2" w16cid:durableId="566455149">
     <w:abstractNumId w:val="1"/>
   </w:num>
-  <w:num w:numId="3">
+  <w:num w:numId="3" w16cid:durableId="1601134782">
     <w:abstractNumId w:val="0"/>
   </w:num>
-  <w:num w:numId="4">
+  <w:num w:numId="4" w16cid:durableId="868221911">
     <w:abstractNumId w:val="2"/>
   </w:num>
 </w:numbering>
 </file>
 
 <file path=word/styles.xml><?xml version="1.0" encoding="utf-8"?>
-<w:styles xmlns:mc="http://schemas.openxmlformats.org/markup-compatibility/2006" xmlns:r="http://schemas.openxmlformats.org/officeDocument/2006/relationships" xmlns:w="http://schemas.openxmlformats.org/wordprocessingml/2006/main" xmlns:w14="http://schemas.microsoft.com/office/word/2010/wordml" xmlns:w15="http://schemas.microsoft.com/office/word/2012/wordml" xmlns:w16cex="http://schemas.microsoft.com/office/word/2018/wordml/cex" xmlns:w16cid="http://schemas.microsoft.com/office/word/2016/wordml/cid" xmlns:w16="http://schemas.microsoft.com/office/word/2018/wordml" xmlns:w16se="http://schemas.microsoft.com/office/word/2015/wordml/symex" mc:Ignorable="w14 w15 w16se w16cid w16 w16cex">
+<w:styles xmlns:mc="http://schemas.openxmlformats.org/markup-compatibility/2006" xmlns:r="http://schemas.openxmlformats.org/officeDocument/2006/relationships" xmlns:w="http://schemas.openxmlformats.org/wordprocessingml/2006/main" xmlns:w14="http://schemas.microsoft.com/office/word/2010/wordml" xmlns:w15="http://schemas.microsoft.com/office/word/2012/wordml" xmlns:w16cex="http://schemas.microsoft.com/office/word/2018/wordml/cex" xmlns:w16cid="http://schemas.microsoft.com/office/word/2016/wordml/cid" xmlns:w16="http://schemas.microsoft.com/office/word/2018/wordml" xmlns:w16du="http://schemas.microsoft.com/office/word/2023/wordml/word16du" xmlns:w16sdtdh="http://schemas.microsoft.com/office/word/2020/wordml/sdtdatahash" xmlns:w16sdtfl="http://schemas.microsoft.com/office/word/2024/wordml/sdtformatlock" xmlns:w16se="http://schemas.microsoft.com/office/word/2015/wordml/symex" mc:Ignorable="w14 w15 w16se w16cid w16 w16cex w16sdtdh w16sdtfl w16du">
   <w:docDefaults>
     <w:rPrDefault>
       <w:rPr>

</xml_diff>